<commit_message>
feat: establish lesson authority workflow and production gates
</commit_message>
<xml_diff>
--- a/output/boya-intermediate/lesson-01/student/lesson-01-prep-card-a.docx
+++ b/output/boya-intermediate/lesson-01/student/lesson-01-prep-card-a.docx
@@ -877,169 +877,53 @@
           <w:sz w:val="32"/>
           <w:lang w:val="zh-CN" w:eastAsia="zh-CN"/>
         </w:rPr>
-        <w:t>三、我想确认</w:t>
+        <w:t>三、上课问同学（选一个）</w:t>
       </w:r>
     </w:p>
-    <w:tbl>
-      <w:tblPr>
-        <w:tblW w:type="dxa" w:w="9360"/>
-        <w:jc w:val="left"/>
-        <w:tblLayout w:type="fixed"/>
-        <w:tblLook w:firstColumn="1" w:firstRow="1" w:lastColumn="0" w:lastRow="0" w:noHBand="0" w:noVBand="1" w:val="04A0"/>
-        <w:tblInd w:w="120" w:type="dxa"/>
-      </w:tblPr>
-      <w:tblGrid>
-        <w:gridCol w:w="4680"/>
-        <w:gridCol w:w="4680"/>
-      </w:tblGrid>
-      <w:tr>
-        <w:tc>
-          <w:tcPr>
-            <w:tcW w:type="dxa" w:w="4680"/>
-            <w:tcMar>
-              <w:top w:w="100" w:type="dxa"/>
-              <w:start w:w="140" w:type="dxa"/>
-              <w:bottom w:w="100" w:type="dxa"/>
-              <w:end w:w="140" w:type="dxa"/>
-            </w:tcMar>
-            <w:vAlign w:val="center"/>
-            <w:shd w:fill="E8EEF5"/>
-            <w:tcBorders>
-              <w:top w:val="single" w:sz="7" w:space="0" w:color="B7C6D6"/>
-              <w:left w:val="single" w:sz="7" w:space="0" w:color="B7C6D6"/>
-              <w:bottom w:val="single" w:sz="7" w:space="0" w:color="B7C6D6"/>
-              <w:right w:val="single" w:sz="7" w:space="0" w:color="B7C6D6"/>
-            </w:tcBorders>
-          </w:tcPr>
-          <w:p>
-            <w:pPr>
-              <w:spacing w:before="0" w:after="0" w:line="252" w:lineRule="auto"/>
-              <w:jc w:val="center"/>
-            </w:pPr>
-            <w:r/>
-            <w:r>
-              <w:rPr>
-                <w:rFonts w:ascii="Times New Roman" w:hAnsi="Times New Roman" w:eastAsia="Noto Sans CJK SC"/>
-                <w:b/>
-                <w:color w:val="1F4D78"/>
-                <w:sz w:val="21"/>
-                <w:lang w:val="zh-CN" w:eastAsia="zh-CN"/>
-              </w:rPr>
-              <w:t>我听到或看到的一个问题</w:t>
-            </w:r>
-          </w:p>
-        </w:tc>
-        <w:tc>
-          <w:tcPr>
-            <w:tcW w:type="dxa" w:w="4680"/>
-            <w:tcMar>
-              <w:top w:w="100" w:type="dxa"/>
-              <w:start w:w="140" w:type="dxa"/>
-              <w:bottom w:w="100" w:type="dxa"/>
-              <w:end w:w="140" w:type="dxa"/>
-            </w:tcMar>
-            <w:vAlign w:val="center"/>
-            <w:shd w:fill="E8EEF5"/>
-            <w:tcBorders>
-              <w:top w:val="single" w:sz="7" w:space="0" w:color="B7C6D6"/>
-              <w:left w:val="single" w:sz="7" w:space="0" w:color="B7C6D6"/>
-              <w:bottom w:val="single" w:sz="7" w:space="0" w:color="B7C6D6"/>
-              <w:right w:val="single" w:sz="7" w:space="0" w:color="B7C6D6"/>
-            </w:tcBorders>
-          </w:tcPr>
-          <w:p>
-            <w:pPr>
-              <w:spacing w:before="0" w:after="0" w:line="252" w:lineRule="auto"/>
-              <w:jc w:val="center"/>
-            </w:pPr>
-            <w:r/>
-            <w:r>
-              <w:rPr>
-                <w:rFonts w:ascii="Times New Roman" w:hAnsi="Times New Roman" w:eastAsia="Noto Sans CJK SC"/>
-                <w:b/>
-                <w:color w:val="1F4D78"/>
-                <w:sz w:val="21"/>
-                <w:lang w:val="zh-CN" w:eastAsia="zh-CN"/>
-              </w:rPr>
-              <w:t>我想问同伴</w:t>
-            </w:r>
-          </w:p>
-        </w:tc>
-      </w:tr>
-      <w:tr>
-        <w:trPr>
-          <w:trHeight w:val="1080"/>
-        </w:trPr>
-        <w:tc>
-          <w:tcPr>
-            <w:tcW w:type="dxa" w:w="4680"/>
-            <w:tcMar>
-              <w:top w:w="100" w:type="dxa"/>
-              <w:start w:w="140" w:type="dxa"/>
-              <w:bottom w:w="100" w:type="dxa"/>
-              <w:end w:w="140" w:type="dxa"/>
-            </w:tcMar>
-            <w:vAlign w:val="center"/>
-            <w:tcBorders>
-              <w:top w:val="single" w:sz="6" w:space="0" w:color="CBD5E1"/>
-              <w:left w:val="single" w:sz="6" w:space="0" w:color="CBD5E1"/>
-              <w:bottom w:val="single" w:sz="6" w:space="0" w:color="CBD5E1"/>
-              <w:right w:val="single" w:sz="6" w:space="0" w:color="CBD5E1"/>
-            </w:tcBorders>
-          </w:tcPr>
-          <w:p>
-            <w:pPr>
-              <w:spacing w:before="0" w:after="0" w:line="264" w:lineRule="auto"/>
-            </w:pPr>
-            <w:r/>
-            <w:r>
-              <w:rPr>
-                <w:rFonts w:ascii="Times New Roman" w:hAnsi="Times New Roman" w:eastAsia="Noto Sans CJK SC"/>
-                <w:color w:val="17324D"/>
-                <w:sz w:val="21"/>
-                <w:lang w:val="zh-CN" w:eastAsia="zh-CN"/>
-              </w:rPr>
-            </w:r>
-          </w:p>
-        </w:tc>
-        <w:tc>
-          <w:tcPr>
-            <w:tcW w:type="dxa" w:w="4680"/>
-            <w:tcMar>
-              <w:top w:w="100" w:type="dxa"/>
-              <w:start w:w="140" w:type="dxa"/>
-              <w:bottom w:w="100" w:type="dxa"/>
-              <w:end w:w="140" w:type="dxa"/>
-            </w:tcMar>
-            <w:vAlign w:val="center"/>
-            <w:tcBorders>
-              <w:top w:val="single" w:sz="6" w:space="0" w:color="CBD5E1"/>
-              <w:left w:val="single" w:sz="6" w:space="0" w:color="CBD5E1"/>
-              <w:bottom w:val="single" w:sz="6" w:space="0" w:color="CBD5E1"/>
-              <w:right w:val="single" w:sz="6" w:space="0" w:color="CBD5E1"/>
-            </w:tcBorders>
-          </w:tcPr>
-          <w:p>
-            <w:pPr>
-              <w:spacing w:before="0" w:after="0" w:line="264" w:lineRule="auto"/>
-            </w:pPr>
-            <w:r/>
-            <w:r>
-              <w:rPr>
-                <w:rFonts w:ascii="Times New Roman" w:hAnsi="Times New Roman" w:eastAsia="Noto Sans CJK SC"/>
-                <w:color w:val="17324D"/>
-                <w:sz w:val="21"/>
-                <w:lang w:val="zh-CN" w:eastAsia="zh-CN"/>
-              </w:rPr>
-            </w:r>
-          </w:p>
-        </w:tc>
-      </w:tr>
-    </w:tbl>
     <w:p>
       <w:pPr>
-        <w:spacing w:after="40"/>
+        <w:spacing w:before="0" w:after="80" w:line="288" w:lineRule="auto"/>
+        <w:ind w:left="403" w:hanging="259"/>
       </w:pPr>
+      <w:r>
+        <w:rPr>
+          <w:rFonts w:ascii="Times New Roman" w:hAnsi="Times New Roman" w:eastAsia="Noto Sans CJK SC"/>
+          <w:color w:val="17324D"/>
+          <w:sz w:val="24"/>
+          <w:lang w:val="zh-CN" w:eastAsia="zh-CN"/>
+        </w:rPr>
+        <w:t>• 你的名字有什么意思？</w:t>
+      </w:r>
+    </w:p>
+    <w:p>
+      <w:pPr>
+        <w:spacing w:before="0" w:after="80" w:line="288" w:lineRule="auto"/>
+        <w:ind w:left="403" w:hanging="259"/>
+      </w:pPr>
+      <w:r>
+        <w:rPr>
+          <w:rFonts w:ascii="Times New Roman" w:hAnsi="Times New Roman" w:eastAsia="Noto Sans CJK SC"/>
+          <w:color w:val="17324D"/>
+          <w:sz w:val="24"/>
+          <w:lang w:val="zh-CN" w:eastAsia="zh-CN"/>
+        </w:rPr>
+        <w:t>• 你的名字从哪里来？</w:t>
+      </w:r>
+    </w:p>
+    <w:p>
+      <w:pPr>
+        <w:spacing w:before="0" w:after="80" w:line="288" w:lineRule="auto"/>
+        <w:ind w:left="403" w:hanging="259"/>
+      </w:pPr>
+      <w:r>
+        <w:rPr>
+          <w:rFonts w:ascii="Times New Roman" w:hAnsi="Times New Roman" w:eastAsia="Noto Sans CJK SC"/>
+          <w:color w:val="17324D"/>
+          <w:sz w:val="24"/>
+          <w:lang w:val="zh-CN" w:eastAsia="zh-CN"/>
+        </w:rPr>
+        <w:t>• 你喜欢自己的名字吗？为什么？</w:t>
+      </w:r>
     </w:p>
     <w:p>
       <w:pPr>
@@ -1264,7 +1148,7 @@
                 <w:sz w:val="21"/>
                 <w:lang w:val="zh-CN" w:eastAsia="zh-CN"/>
               </w:rPr>
-              <w:t>我的追问</w:t>
+              <w:t>一个相同点或不同点</w:t>
             </w:r>
           </w:p>
         </w:tc>

</xml_diff>